<commit_message>
some improoving on radio selection. genre selection global check- uncheck on format converter Wikipedia on artists with picture
</commit_message>
<xml_diff>
--- a/docs/Euterpe guida utente.docx
+++ b/docs/Euterpe guida utente.docx
@@ -205,7 +205,13 @@
     <w:sdt>
       <w:sdtPr>
         <w:rPr>
-          <w:lang w:val="en-GB"/>
+          <w:rFonts w:asciiTheme="minorHAnsi" w:eastAsiaTheme="minorHAnsi" w:hAnsiTheme="minorHAnsi" w:cstheme="minorBidi"/>
+          <w:color w:val="auto"/>
+          <w:kern w:val="2"/>
+          <w:sz w:val="22"/>
+          <w:szCs w:val="22"/>
+          <w:lang w:val="en-GB" w:eastAsia="en-US"/>
+          <w14:ligatures w14:val="standardContextual"/>
         </w:rPr>
         <w:id w:val="-1218350441"/>
         <w:docPartObj>
@@ -215,15 +221,8 @@
       </w:sdtPr>
       <w:sdtEndPr>
         <w:rPr>
-          <w:rFonts w:asciiTheme="minorHAnsi" w:eastAsiaTheme="minorHAnsi" w:hAnsiTheme="minorHAnsi" w:cstheme="minorBidi"/>
           <w:b/>
           <w:bCs/>
-          <w:color w:val="auto"/>
-          <w:kern w:val="2"/>
-          <w:sz w:val="22"/>
-          <w:szCs w:val="22"/>
-          <w:lang w:eastAsia="en-US"/>
-          <w14:ligatures w14:val="standardContextual"/>
         </w:rPr>
       </w:sdtEndPr>
       <w:sdtContent>
@@ -863,14 +862,7 @@
           <w:rFonts w:ascii="Times New Roman" w:hAnsi="Times New Roman" w:cs="Times New Roman"/>
           <w:kern w:val="0"/>
         </w:rPr>
-        <w:t xml:space="preserve">Data una cartella che contiene file MP3, </w:t>
-      </w:r>
-      <w:r>
-        <w:rPr>
-          <w:rFonts w:ascii="Times New Roman" w:hAnsi="Times New Roman" w:cs="Times New Roman"/>
-          <w:kern w:val="0"/>
-        </w:rPr>
-        <w:t>Euterpe permette di indicizzarla in base ai tag dei file MP3</w:t>
+        <w:t>Data una cartella che contiene file MP3, Euterpe permette di indicizzarla in base ai tag dei file MP3</w:t>
       </w:r>
       <w:r>
         <w:rPr>
@@ -1803,6 +1795,7 @@
       <w:r>
         <w:rPr>
           <w:rFonts w:ascii="Times New Roman" w:hAnsi="Times New Roman" w:cs="Times New Roman"/>
+          <w:noProof/>
           <w:kern w:val="0"/>
         </w:rPr>
         <w:drawing>
@@ -2081,6 +2074,7 @@
       <w:r>
         <w:rPr>
           <w:rFonts w:ascii="Times New Roman" w:hAnsi="Times New Roman" w:cs="Times New Roman"/>
+          <w:noProof/>
           <w:kern w:val="0"/>
         </w:rPr>
         <w:drawing>
@@ -2156,6 +2150,7 @@
       <w:r>
         <w:rPr>
           <w:rFonts w:ascii="Times New Roman" w:hAnsi="Times New Roman" w:cs="Times New Roman"/>
+          <w:noProof/>
           <w:kern w:val="0"/>
         </w:rPr>
         <w:drawing>
@@ -2217,6 +2212,7 @@
       <w:r>
         <w:rPr>
           <w:rFonts w:ascii="Times New Roman" w:hAnsi="Times New Roman" w:cs="Times New Roman"/>
+          <w:noProof/>
           <w:kern w:val="0"/>
         </w:rPr>
         <w:drawing>
@@ -2278,6 +2274,7 @@
       <w:r>
         <w:rPr>
           <w:rFonts w:ascii="Times New Roman" w:hAnsi="Times New Roman" w:cs="Times New Roman"/>
+          <w:noProof/>
           <w:kern w:val="0"/>
         </w:rPr>
         <w:drawing>
@@ -2389,7 +2386,21 @@
           <w:rFonts w:ascii="Times New Roman" w:hAnsi="Times New Roman" w:cs="Times New Roman"/>
           <w:kern w:val="0"/>
         </w:rPr>
-        <w:t xml:space="preserve"> file mp3 e la casella in cui digitare il testo pe</w:t>
+        <w:t xml:space="preserve"> file mp3</w:t>
+      </w:r>
+      <w:r>
+        <w:rPr>
+          <w:rFonts w:ascii="Times New Roman" w:hAnsi="Times New Roman" w:cs="Times New Roman"/>
+          <w:kern w:val="0"/>
+        </w:rPr>
+        <w:t>, accanto a questa troviamo</w:t>
+      </w:r>
+      <w:r>
+        <w:rPr>
+          <w:rFonts w:ascii="Times New Roman" w:hAnsi="Times New Roman" w:cs="Times New Roman"/>
+          <w:kern w:val="0"/>
+        </w:rPr>
+        <w:t xml:space="preserve"> la casella in cui digitare il testo pe</w:t>
       </w:r>
       <w:r>
         <w:rPr>
@@ -2424,6 +2435,7 @@
       <w:r>
         <w:rPr>
           <w:rFonts w:ascii="Times New Roman" w:hAnsi="Times New Roman" w:cs="Times New Roman"/>
+          <w:noProof/>
           <w:kern w:val="0"/>
         </w:rPr>
         <w:drawing>
@@ -2467,7 +2479,21 @@
           <w:rFonts w:ascii="Times New Roman" w:hAnsi="Times New Roman" w:cs="Times New Roman"/>
           <w:kern w:val="0"/>
         </w:rPr>
-        <w:t xml:space="preserve"> è usato per impostare la cartella dei file Mp3, accanto appare il percorso della cartella. Al primo avvio questa casella è vuota ai successivi </w:t>
+        <w:t xml:space="preserve"> è usato per impostare la cartella dei file Mp3, accanto </w:t>
+      </w:r>
+      <w:r>
+        <w:rPr>
+          <w:rFonts w:ascii="Times New Roman" w:hAnsi="Times New Roman" w:cs="Times New Roman"/>
+          <w:kern w:val="0"/>
+        </w:rPr>
+        <w:t xml:space="preserve">a questo </w:t>
+      </w:r>
+      <w:r>
+        <w:rPr>
+          <w:rFonts w:ascii="Times New Roman" w:hAnsi="Times New Roman" w:cs="Times New Roman"/>
+          <w:kern w:val="0"/>
+        </w:rPr>
+        <w:t xml:space="preserve">appare il percorso della cartella. Al primo avvio questa casella è vuota ai successivi </w:t>
       </w:r>
       <w:r>
         <w:rPr>
@@ -2592,7 +2618,21 @@
           <w:rFonts w:ascii="Times New Roman" w:hAnsi="Times New Roman" w:cs="Times New Roman"/>
           <w:kern w:val="0"/>
         </w:rPr>
-        <w:t>In basso a sinistra abbiamo un riquadro dove alternativamente vine mostrata la copertina dell’album selezionato o l’elenco dei brani della playlis</w:t>
+        <w:t>In basso a sinistra abbiamo un riquadro dove alternativamente vi</w:t>
+      </w:r>
+      <w:r>
+        <w:rPr>
+          <w:rFonts w:ascii="Times New Roman" w:hAnsi="Times New Roman" w:cs="Times New Roman"/>
+          <w:kern w:val="0"/>
+        </w:rPr>
+        <w:t>e</w:t>
+      </w:r>
+      <w:r>
+        <w:rPr>
+          <w:rFonts w:ascii="Times New Roman" w:hAnsi="Times New Roman" w:cs="Times New Roman"/>
+          <w:kern w:val="0"/>
+        </w:rPr>
+        <w:t>ne mostrata la copertina dell’album selezionato o l’elenco dei brani della playlis</w:t>
       </w:r>
       <w:r>
         <w:rPr>
@@ -2626,7 +2666,21 @@
           <w:rFonts w:ascii="Times New Roman" w:hAnsi="Times New Roman" w:cs="Times New Roman"/>
           <w:kern w:val="0"/>
         </w:rPr>
-        <w:t>In basso a destra troviamo l’elenco delle tracce.</w:t>
+        <w:t>In basso a destra troviamo l’elenco delle tracce</w:t>
+      </w:r>
+      <w:r>
+        <w:rPr>
+          <w:rFonts w:ascii="Times New Roman" w:hAnsi="Times New Roman" w:cs="Times New Roman"/>
+          <w:kern w:val="0"/>
+        </w:rPr>
+        <w:t xml:space="preserve"> dell’album selezionato</w:t>
+      </w:r>
+      <w:r>
+        <w:rPr>
+          <w:rFonts w:ascii="Times New Roman" w:hAnsi="Times New Roman" w:cs="Times New Roman"/>
+          <w:kern w:val="0"/>
+        </w:rPr>
+        <w:t>.</w:t>
       </w:r>
     </w:p>
     <w:p>
@@ -2648,7 +2702,14 @@
           <w:rFonts w:ascii="Times New Roman" w:hAnsi="Times New Roman" w:cs="Times New Roman"/>
           <w:kern w:val="0"/>
         </w:rPr>
-        <w:t xml:space="preserve"> che si trovano quella </w:t>
+        <w:t xml:space="preserve"> che si trovano </w:t>
+      </w:r>
+      <w:r>
+        <w:rPr>
+          <w:rFonts w:ascii="Times New Roman" w:hAnsi="Times New Roman" w:cs="Times New Roman"/>
+          <w:kern w:val="0"/>
+        </w:rPr>
+        <w:t xml:space="preserve">sotto quella di </w:t>
       </w:r>
       <w:r>
         <w:rPr>
@@ -2662,7 +2723,21 @@
           <w:rFonts w:ascii="Times New Roman" w:hAnsi="Times New Roman" w:cs="Times New Roman"/>
           <w:kern w:val="0"/>
         </w:rPr>
-        <w:t>ma in base al contenuto dei tag dei file MP3.</w:t>
+        <w:t xml:space="preserve">ma </w:t>
+      </w:r>
+      <w:r>
+        <w:rPr>
+          <w:rFonts w:ascii="Times New Roman" w:hAnsi="Times New Roman" w:cs="Times New Roman"/>
+          <w:kern w:val="0"/>
+        </w:rPr>
+        <w:t xml:space="preserve">attingendo </w:t>
+      </w:r>
+      <w:r>
+        <w:rPr>
+          <w:rFonts w:ascii="Times New Roman" w:hAnsi="Times New Roman" w:cs="Times New Roman"/>
+          <w:kern w:val="0"/>
+        </w:rPr>
+        <w:t>al contenuto dei tag dei file MP3.</w:t>
       </w:r>
       <w:r>
         <w:rPr>
@@ -2684,7 +2759,21 @@
           <w:rFonts w:ascii="Times New Roman" w:hAnsi="Times New Roman" w:cs="Times New Roman"/>
           <w:kern w:val="0"/>
         </w:rPr>
-        <w:t>Può capitare che lo stesso artista appaia più volte nella lista degli artisti perché è stato scritto in maniera diversa nei vari album. Ad esempio, Fabrizio de Andre, Fabrizio Deandré, Fabrizio de André. In questi casi è possibile editare i tag degli album per normalizzare il nome.</w:t>
+        <w:t>Può capitare che lo stesso artista appaia più volte nella lista degli artisti</w:t>
+      </w:r>
+      <w:r>
+        <w:rPr>
+          <w:rFonts w:ascii="Times New Roman" w:hAnsi="Times New Roman" w:cs="Times New Roman"/>
+          <w:kern w:val="0"/>
+        </w:rPr>
+        <w:t xml:space="preserve">, questo accade </w:t>
+      </w:r>
+      <w:r>
+        <w:rPr>
+          <w:rFonts w:ascii="Times New Roman" w:hAnsi="Times New Roman" w:cs="Times New Roman"/>
+          <w:kern w:val="0"/>
+        </w:rPr>
+        <w:t xml:space="preserve"> perché è stato scritto in maniera diversa nei vari album. Ad esempio, Fabrizio de Andre, Fabrizio Deandré, Fabrizio de André. In questi casi è possibile editare i tag degli album per normalizzare il nome.</w:t>
       </w:r>
     </w:p>
     <w:p>
@@ -2714,7 +2803,21 @@
           <w:rFonts w:ascii="Times New Roman" w:hAnsi="Times New Roman" w:cs="Times New Roman"/>
           <w:kern w:val="0"/>
         </w:rPr>
-        <w:t>Selezionando un album nel riquadro in basso a sinistra appare la copertina dell’album, mentre nel riquadro in basso a sinistra appare l’elenco delle tracce dell’album ordinate secondo la sequenza con cui si trovano sul disco o CD originale.</w:t>
+        <w:t xml:space="preserve">Selezionando un album nel riquadro in basso a sinistra appare la copertina dell’album, mentre nel riquadro in basso a </w:t>
+      </w:r>
+      <w:r>
+        <w:rPr>
+          <w:rFonts w:ascii="Times New Roman" w:hAnsi="Times New Roman" w:cs="Times New Roman"/>
+          <w:kern w:val="0"/>
+        </w:rPr>
+        <w:t>destra</w:t>
+      </w:r>
+      <w:r>
+        <w:rPr>
+          <w:rFonts w:ascii="Times New Roman" w:hAnsi="Times New Roman" w:cs="Times New Roman"/>
+          <w:kern w:val="0"/>
+        </w:rPr>
+        <w:t xml:space="preserve"> appare l’elenco delle tracce dell’album ordinate secondo la sequenza con cui si trovano sul disco o CD originale.</w:t>
       </w:r>
     </w:p>
     <w:p>
@@ -2732,6 +2835,91 @@
           <w:kern w:val="0"/>
         </w:rPr>
       </w:pPr>
+      <w:r>
+        <w:rPr>
+          <w:rFonts w:ascii="Times New Roman" w:hAnsi="Times New Roman" w:cs="Times New Roman"/>
+          <w:kern w:val="0"/>
+        </w:rPr>
+        <w:t>Ci sono due modi di creare una playlist:</w:t>
+      </w:r>
+    </w:p>
+    <w:p>
+      <w:pPr>
+        <w:pStyle w:val="ListParagraph"/>
+        <w:numPr>
+          <w:ilvl w:val="0"/>
+          <w:numId w:val="6"/>
+        </w:numPr>
+        <w:rPr>
+          <w:rFonts w:ascii="Times New Roman" w:hAnsi="Times New Roman" w:cs="Times New Roman"/>
+          <w:kern w:val="0"/>
+        </w:rPr>
+      </w:pPr>
+      <w:r>
+        <w:rPr>
+          <w:rFonts w:ascii="Times New Roman" w:hAnsi="Times New Roman" w:cs="Times New Roman"/>
+          <w:kern w:val="0"/>
+        </w:rPr>
+        <w:t>Selezionando singolarmente gli album e o le tracce</w:t>
+      </w:r>
+    </w:p>
+    <w:p>
+      <w:pPr>
+        <w:pStyle w:val="ListParagraph"/>
+        <w:numPr>
+          <w:ilvl w:val="0"/>
+          <w:numId w:val="6"/>
+        </w:numPr>
+        <w:rPr>
+          <w:rFonts w:ascii="Times New Roman" w:hAnsi="Times New Roman" w:cs="Times New Roman"/>
+          <w:kern w:val="0"/>
+        </w:rPr>
+      </w:pPr>
+      <w:r>
+        <w:rPr>
+          <w:rFonts w:ascii="Times New Roman" w:hAnsi="Times New Roman" w:cs="Times New Roman"/>
+          <w:kern w:val="0"/>
+        </w:rPr>
+        <w:t>Facendolo creare in modo automatico in base alle proprie preferenze.</w:t>
+      </w:r>
+    </w:p>
+    <w:p>
+      <w:pPr>
+        <w:rPr>
+          <w:rFonts w:ascii="Times New Roman" w:hAnsi="Times New Roman" w:cs="Times New Roman"/>
+          <w:kern w:val="0"/>
+        </w:rPr>
+      </w:pPr>
+      <w:r>
+        <w:rPr>
+          <w:rFonts w:ascii="Times New Roman" w:hAnsi="Times New Roman" w:cs="Times New Roman"/>
+          <w:kern w:val="0"/>
+        </w:rPr>
+        <w:t>La voce di  menu contestuale “aggiunge alla playlist, appare sia nel riquadro degli album che in quello delle tracce. Se lo si attiva dal riquadro degli album tutte le tracce degli album selezionati verranno inserite nella playlist. Se lo si attiva dal riquadro tracce tutte le tracce selezionate verranno inserite nella playlist.</w:t>
+      </w:r>
+    </w:p>
+    <w:p>
+      <w:pPr>
+        <w:pStyle w:val="Heading2"/>
+      </w:pPr>
+      <w:r>
+        <w:t>Le ricerche</w:t>
+      </w:r>
+    </w:p>
+    <w:p>
+      <w:pPr>
+        <w:rPr>
+          <w:rFonts w:ascii="Times New Roman" w:hAnsi="Times New Roman" w:cs="Times New Roman"/>
+          <w:kern w:val="0"/>
+        </w:rPr>
+      </w:pPr>
+      <w:r>
+        <w:rPr>
+          <w:rFonts w:ascii="Times New Roman" w:hAnsi="Times New Roman" w:cs="Times New Roman"/>
+          <w:kern w:val="0"/>
+        </w:rPr>
+        <w:t>Quando si digita del testo nella casella delle ricerche questo è usato in tempo reale per evidenziare il primo artista che contiene i caratteri digitati</w:t>
+      </w:r>
     </w:p>
     <w:p>
       <w:pPr>
@@ -2966,37 +3154,65 @@
           <w:rFonts w:ascii="Times New Roman" w:hAnsi="Times New Roman" w:cs="Times New Roman"/>
           <w:kern w:val="0"/>
         </w:rPr>
-        <w:t xml:space="preserve">Nella parte alta troviamo la casella per la ricerca delle stazioni radio. </w:t>
-      </w:r>
-    </w:p>
-    <w:p>
-      <w:pPr>
-        <w:rPr>
-          <w:rFonts w:ascii="Times New Roman" w:hAnsi="Times New Roman" w:cs="Times New Roman"/>
-          <w:kern w:val="0"/>
-        </w:rPr>
-      </w:pPr>
-      <w:r>
-        <w:rPr>
-          <w:rFonts w:ascii="Times New Roman" w:hAnsi="Times New Roman" w:cs="Times New Roman"/>
-          <w:kern w:val="0"/>
-        </w:rPr>
-        <w:t>Sotto abbiamo la lista delle stazioni individuata in base alla ricerca.</w:t>
-      </w:r>
-    </w:p>
-    <w:p>
-      <w:pPr>
-        <w:rPr>
-          <w:rFonts w:ascii="Times New Roman" w:hAnsi="Times New Roman" w:cs="Times New Roman"/>
-          <w:kern w:val="0"/>
-        </w:rPr>
-      </w:pPr>
-      <w:r>
-        <w:rPr>
-          <w:rFonts w:ascii="Times New Roman" w:hAnsi="Times New Roman" w:cs="Times New Roman"/>
-          <w:kern w:val="0"/>
-        </w:rPr>
-        <w:t>Infine, troviamo la lista delle stazioni radio preferite.</w:t>
+        <w:t>Nella parte alta troviamo la casella per la ricerca delle stazioni radio.</w:t>
+      </w:r>
+    </w:p>
+    <w:p>
+      <w:pPr>
+        <w:rPr>
+          <w:rFonts w:ascii="Times New Roman" w:hAnsi="Times New Roman" w:cs="Times New Roman"/>
+          <w:kern w:val="0"/>
+        </w:rPr>
+      </w:pPr>
+      <w:r>
+        <w:rPr>
+          <w:rFonts w:ascii="Times New Roman" w:hAnsi="Times New Roman" w:cs="Times New Roman"/>
+          <w:kern w:val="0"/>
+        </w:rPr>
+        <w:t>Sotto</w:t>
+      </w:r>
+      <w:r>
+        <w:rPr>
+          <w:rFonts w:ascii="Times New Roman" w:hAnsi="Times New Roman" w:cs="Times New Roman"/>
+          <w:kern w:val="0"/>
+        </w:rPr>
+        <w:t xml:space="preserve"> questa troviamo </w:t>
+      </w:r>
+      <w:r>
+        <w:rPr>
+          <w:rFonts w:ascii="Times New Roman" w:hAnsi="Times New Roman" w:cs="Times New Roman"/>
+          <w:kern w:val="0"/>
+        </w:rPr>
+        <w:t>la lista delle stazioni individuata in base alla ricerca.</w:t>
+      </w:r>
+    </w:p>
+    <w:p>
+      <w:pPr>
+        <w:rPr>
+          <w:rFonts w:ascii="Times New Roman" w:hAnsi="Times New Roman" w:cs="Times New Roman"/>
+          <w:kern w:val="0"/>
+        </w:rPr>
+      </w:pPr>
+      <w:r>
+        <w:rPr>
+          <w:rFonts w:ascii="Times New Roman" w:hAnsi="Times New Roman" w:cs="Times New Roman"/>
+          <w:kern w:val="0"/>
+        </w:rPr>
+        <w:t xml:space="preserve">Infine, </w:t>
+      </w:r>
+      <w:r>
+        <w:rPr>
+          <w:rFonts w:ascii="Times New Roman" w:hAnsi="Times New Roman" w:cs="Times New Roman"/>
+          <w:kern w:val="0"/>
+        </w:rPr>
+        <w:t xml:space="preserve">nella parte inferiore </w:t>
+      </w:r>
+      <w:r>
+        <w:rPr>
+          <w:rFonts w:ascii="Times New Roman" w:hAnsi="Times New Roman" w:cs="Times New Roman"/>
+          <w:kern w:val="0"/>
+        </w:rPr>
+        <w:t>troviamo la lista delle stazioni radio preferite.</w:t>
       </w:r>
     </w:p>
     <w:p>
@@ -3145,10 +3361,7 @@
       <w:bookmarkStart w:id="9" w:name="_Toc213176803"/>
       <w:r>
         <w:lastRenderedPageBreak/>
-        <w:t xml:space="preserve">La finestra </w:t>
-      </w:r>
-      <w:r>
-        <w:t>riproduzione</w:t>
+        <w:t>La finestra riproduzione</w:t>
       </w:r>
       <w:bookmarkEnd w:id="9"/>
     </w:p>
@@ -4407,9 +4620,9 @@
 <file path=word/numbering.xml><?xml version="1.0" encoding="utf-8"?>
 <w:numbering xmlns:wpc="http://schemas.microsoft.com/office/word/2010/wordprocessingCanvas" xmlns:cx="http://schemas.microsoft.com/office/drawing/2014/chartex" xmlns:cx1="http://schemas.microsoft.com/office/drawing/2015/9/8/chartex" xmlns:cx2="http://schemas.microsoft.com/office/drawing/2015/10/21/chartex" xmlns:cx3="http://schemas.microsoft.com/office/drawing/2016/5/9/chartex" xmlns:cx4="http://schemas.microsoft.com/office/drawing/2016/5/10/chartex" xmlns:cx5="http://schemas.microsoft.com/office/drawing/2016/5/11/chartex" xmlns:cx6="http://schemas.microsoft.com/office/drawing/2016/5/12/chartex" xmlns:cx7="http://schemas.microsoft.com/office/drawing/2016/5/13/chartex" xmlns:cx8="http://schemas.microsoft.com/office/drawing/2016/5/14/chartex" xmlns:mc="http://schemas.openxmlformats.org/markup-compatibility/2006" xmlns:aink="http://schemas.microsoft.com/office/drawing/2016/ink" xmlns:am3d="http://schemas.microsoft.com/office/drawing/2017/model3d" xmlns:o="urn:schemas-microsoft-com:office:office" xmlns:oel="http://schemas.microsoft.com/office/2019/extlst" xmlns:r="http://schemas.openxmlformats.org/officeDocument/2006/relationships" xmlns:m="http://schemas.openxmlformats.org/officeDocument/2006/math" xmlns:v="urn:schemas-microsoft-com:vml" xmlns:wp14="http://schemas.microsoft.com/office/word/2010/wordprocessingDrawing" xmlns:wp="http://schemas.openxmlformats.org/drawingml/2006/wordprocessingDrawing" xmlns:w10="urn:schemas-microsoft-com:office:word" xmlns:w="http://schemas.openxmlformats.org/wordprocessingml/2006/main" xmlns:w14="http://schemas.microsoft.com/office/word/2010/wordml" xmlns:w15="http://schemas.microsoft.com/office/word/2012/wordml" xmlns:w16cex="http://schemas.microsoft.com/office/word/2018/wordml/cex" xmlns:w16cid="http://schemas.microsoft.com/office/word/2016/wordml/cid" xmlns:w16="http://schemas.microsoft.com/office/word/2018/wordml" xmlns:w16du="http://schemas.microsoft.com/office/word/2023/wordml/word16du" xmlns:w16sdtdh="http://schemas.microsoft.com/office/word/2020/wordml/sdtdatahash" xmlns:w16sdtfl="http://schemas.microsoft.com/office/word/2024/wordml/sdtformatlock" xmlns:w16se="http://schemas.microsoft.com/office/word/2015/wordml/symex" xmlns:wpg="http://schemas.microsoft.com/office/word/2010/wordprocessingGroup" xmlns:wpi="http://schemas.microsoft.com/office/word/2010/wordprocessingInk" xmlns:wne="http://schemas.microsoft.com/office/word/2006/wordml" xmlns:wps="http://schemas.microsoft.com/office/word/2010/wordprocessingShape" mc:Ignorable="w14 w15 w16se w16cid w16 w16cex w16sdtdh w16sdtfl w16du wp14">
   <w:abstractNum w:abstractNumId="0" w15:restartNumberingAfterBreak="0">
-    <w:nsid w:val="2C5276F6"/>
+    <w:nsid w:val="1A1A1967"/>
     <w:multiLevelType w:val="hybridMultilevel"/>
-    <w:tmpl w:val="FC3627A4"/>
+    <w:tmpl w:val="6B10C450"/>
     <w:lvl w:ilvl="0" w:tplc="04100001">
       <w:start w:val="1"/>
       <w:numFmt w:val="bullet"/>
@@ -4520,9 +4733,9 @@
     </w:lvl>
   </w:abstractNum>
   <w:abstractNum w:abstractNumId="1" w15:restartNumberingAfterBreak="0">
-    <w:nsid w:val="4B571D3E"/>
+    <w:nsid w:val="2C5276F6"/>
     <w:multiLevelType w:val="hybridMultilevel"/>
-    <w:tmpl w:val="EFE6DC2E"/>
+    <w:tmpl w:val="FC3627A4"/>
     <w:lvl w:ilvl="0" w:tplc="04100001">
       <w:start w:val="1"/>
       <w:numFmt w:val="bullet"/>
@@ -4633,9 +4846,9 @@
     </w:lvl>
   </w:abstractNum>
   <w:abstractNum w:abstractNumId="2" w15:restartNumberingAfterBreak="0">
-    <w:nsid w:val="560F561B"/>
+    <w:nsid w:val="4B571D3E"/>
     <w:multiLevelType w:val="hybridMultilevel"/>
-    <w:tmpl w:val="FE687232"/>
+    <w:tmpl w:val="EFE6DC2E"/>
     <w:lvl w:ilvl="0" w:tplc="04100001">
       <w:start w:val="1"/>
       <w:numFmt w:val="bullet"/>
@@ -4746,95 +4959,9 @@
     </w:lvl>
   </w:abstractNum>
   <w:abstractNum w:abstractNumId="3" w15:restartNumberingAfterBreak="0">
-    <w:nsid w:val="5A1C2E28"/>
+    <w:nsid w:val="560F561B"/>
     <w:multiLevelType w:val="hybridMultilevel"/>
-    <w:tmpl w:val="FC226582"/>
-    <w:lvl w:ilvl="0" w:tplc="0410000F">
-      <w:start w:val="1"/>
-      <w:numFmt w:val="decimal"/>
-      <w:lvlText w:val="%1."/>
-      <w:lvlJc w:val="left"/>
-      <w:pPr>
-        <w:ind w:left="720" w:hanging="360"/>
-      </w:pPr>
-    </w:lvl>
-    <w:lvl w:ilvl="1" w:tplc="04100019" w:tentative="1">
-      <w:start w:val="1"/>
-      <w:numFmt w:val="lowerLetter"/>
-      <w:lvlText w:val="%2."/>
-      <w:lvlJc w:val="left"/>
-      <w:pPr>
-        <w:ind w:left="1440" w:hanging="360"/>
-      </w:pPr>
-    </w:lvl>
-    <w:lvl w:ilvl="2" w:tplc="0410001B" w:tentative="1">
-      <w:start w:val="1"/>
-      <w:numFmt w:val="lowerRoman"/>
-      <w:lvlText w:val="%3."/>
-      <w:lvlJc w:val="right"/>
-      <w:pPr>
-        <w:ind w:left="2160" w:hanging="180"/>
-      </w:pPr>
-    </w:lvl>
-    <w:lvl w:ilvl="3" w:tplc="0410000F" w:tentative="1">
-      <w:start w:val="1"/>
-      <w:numFmt w:val="decimal"/>
-      <w:lvlText w:val="%4."/>
-      <w:lvlJc w:val="left"/>
-      <w:pPr>
-        <w:ind w:left="2880" w:hanging="360"/>
-      </w:pPr>
-    </w:lvl>
-    <w:lvl w:ilvl="4" w:tplc="04100019" w:tentative="1">
-      <w:start w:val="1"/>
-      <w:numFmt w:val="lowerLetter"/>
-      <w:lvlText w:val="%5."/>
-      <w:lvlJc w:val="left"/>
-      <w:pPr>
-        <w:ind w:left="3600" w:hanging="360"/>
-      </w:pPr>
-    </w:lvl>
-    <w:lvl w:ilvl="5" w:tplc="0410001B" w:tentative="1">
-      <w:start w:val="1"/>
-      <w:numFmt w:val="lowerRoman"/>
-      <w:lvlText w:val="%6."/>
-      <w:lvlJc w:val="right"/>
-      <w:pPr>
-        <w:ind w:left="4320" w:hanging="180"/>
-      </w:pPr>
-    </w:lvl>
-    <w:lvl w:ilvl="6" w:tplc="0410000F" w:tentative="1">
-      <w:start w:val="1"/>
-      <w:numFmt w:val="decimal"/>
-      <w:lvlText w:val="%7."/>
-      <w:lvlJc w:val="left"/>
-      <w:pPr>
-        <w:ind w:left="5040" w:hanging="360"/>
-      </w:pPr>
-    </w:lvl>
-    <w:lvl w:ilvl="7" w:tplc="04100019" w:tentative="1">
-      <w:start w:val="1"/>
-      <w:numFmt w:val="lowerLetter"/>
-      <w:lvlText w:val="%8."/>
-      <w:lvlJc w:val="left"/>
-      <w:pPr>
-        <w:ind w:left="5760" w:hanging="360"/>
-      </w:pPr>
-    </w:lvl>
-    <w:lvl w:ilvl="8" w:tplc="0410001B" w:tentative="1">
-      <w:start w:val="1"/>
-      <w:numFmt w:val="lowerRoman"/>
-      <w:lvlText w:val="%9."/>
-      <w:lvlJc w:val="right"/>
-      <w:pPr>
-        <w:ind w:left="6480" w:hanging="180"/>
-      </w:pPr>
-    </w:lvl>
-  </w:abstractNum>
-  <w:abstractNum w:abstractNumId="4" w15:restartNumberingAfterBreak="0">
-    <w:nsid w:val="642113FA"/>
-    <w:multiLevelType w:val="hybridMultilevel"/>
-    <w:tmpl w:val="1230407A"/>
+    <w:tmpl w:val="FE687232"/>
     <w:lvl w:ilvl="0" w:tplc="04100001">
       <w:start w:val="1"/>
       <w:numFmt w:val="bullet"/>
@@ -4944,20 +5071,222 @@
       </w:rPr>
     </w:lvl>
   </w:abstractNum>
+  <w:abstractNum w:abstractNumId="4" w15:restartNumberingAfterBreak="0">
+    <w:nsid w:val="5A1C2E28"/>
+    <w:multiLevelType w:val="hybridMultilevel"/>
+    <w:tmpl w:val="FC226582"/>
+    <w:lvl w:ilvl="0" w:tplc="0410000F">
+      <w:start w:val="1"/>
+      <w:numFmt w:val="decimal"/>
+      <w:lvlText w:val="%1."/>
+      <w:lvlJc w:val="left"/>
+      <w:pPr>
+        <w:ind w:left="720" w:hanging="360"/>
+      </w:pPr>
+    </w:lvl>
+    <w:lvl w:ilvl="1" w:tplc="04100019" w:tentative="1">
+      <w:start w:val="1"/>
+      <w:numFmt w:val="lowerLetter"/>
+      <w:lvlText w:val="%2."/>
+      <w:lvlJc w:val="left"/>
+      <w:pPr>
+        <w:ind w:left="1440" w:hanging="360"/>
+      </w:pPr>
+    </w:lvl>
+    <w:lvl w:ilvl="2" w:tplc="0410001B" w:tentative="1">
+      <w:start w:val="1"/>
+      <w:numFmt w:val="lowerRoman"/>
+      <w:lvlText w:val="%3."/>
+      <w:lvlJc w:val="right"/>
+      <w:pPr>
+        <w:ind w:left="2160" w:hanging="180"/>
+      </w:pPr>
+    </w:lvl>
+    <w:lvl w:ilvl="3" w:tplc="0410000F" w:tentative="1">
+      <w:start w:val="1"/>
+      <w:numFmt w:val="decimal"/>
+      <w:lvlText w:val="%4."/>
+      <w:lvlJc w:val="left"/>
+      <w:pPr>
+        <w:ind w:left="2880" w:hanging="360"/>
+      </w:pPr>
+    </w:lvl>
+    <w:lvl w:ilvl="4" w:tplc="04100019" w:tentative="1">
+      <w:start w:val="1"/>
+      <w:numFmt w:val="lowerLetter"/>
+      <w:lvlText w:val="%5."/>
+      <w:lvlJc w:val="left"/>
+      <w:pPr>
+        <w:ind w:left="3600" w:hanging="360"/>
+      </w:pPr>
+    </w:lvl>
+    <w:lvl w:ilvl="5" w:tplc="0410001B" w:tentative="1">
+      <w:start w:val="1"/>
+      <w:numFmt w:val="lowerRoman"/>
+      <w:lvlText w:val="%6."/>
+      <w:lvlJc w:val="right"/>
+      <w:pPr>
+        <w:ind w:left="4320" w:hanging="180"/>
+      </w:pPr>
+    </w:lvl>
+    <w:lvl w:ilvl="6" w:tplc="0410000F" w:tentative="1">
+      <w:start w:val="1"/>
+      <w:numFmt w:val="decimal"/>
+      <w:lvlText w:val="%7."/>
+      <w:lvlJc w:val="left"/>
+      <w:pPr>
+        <w:ind w:left="5040" w:hanging="360"/>
+      </w:pPr>
+    </w:lvl>
+    <w:lvl w:ilvl="7" w:tplc="04100019" w:tentative="1">
+      <w:start w:val="1"/>
+      <w:numFmt w:val="lowerLetter"/>
+      <w:lvlText w:val="%8."/>
+      <w:lvlJc w:val="left"/>
+      <w:pPr>
+        <w:ind w:left="5760" w:hanging="360"/>
+      </w:pPr>
+    </w:lvl>
+    <w:lvl w:ilvl="8" w:tplc="0410001B" w:tentative="1">
+      <w:start w:val="1"/>
+      <w:numFmt w:val="lowerRoman"/>
+      <w:lvlText w:val="%9."/>
+      <w:lvlJc w:val="right"/>
+      <w:pPr>
+        <w:ind w:left="6480" w:hanging="180"/>
+      </w:pPr>
+    </w:lvl>
+  </w:abstractNum>
+  <w:abstractNum w:abstractNumId="5" w15:restartNumberingAfterBreak="0">
+    <w:nsid w:val="642113FA"/>
+    <w:multiLevelType w:val="hybridMultilevel"/>
+    <w:tmpl w:val="1230407A"/>
+    <w:lvl w:ilvl="0" w:tplc="04100001">
+      <w:start w:val="1"/>
+      <w:numFmt w:val="bullet"/>
+      <w:lvlText w:val=""/>
+      <w:lvlJc w:val="left"/>
+      <w:pPr>
+        <w:ind w:left="720" w:hanging="360"/>
+      </w:pPr>
+      <w:rPr>
+        <w:rFonts w:ascii="Symbol" w:hAnsi="Symbol" w:hint="default"/>
+      </w:rPr>
+    </w:lvl>
+    <w:lvl w:ilvl="1" w:tplc="04100003" w:tentative="1">
+      <w:start w:val="1"/>
+      <w:numFmt w:val="bullet"/>
+      <w:lvlText w:val="o"/>
+      <w:lvlJc w:val="left"/>
+      <w:pPr>
+        <w:ind w:left="1440" w:hanging="360"/>
+      </w:pPr>
+      <w:rPr>
+        <w:rFonts w:ascii="Courier New" w:hAnsi="Courier New" w:cs="Courier New" w:hint="default"/>
+      </w:rPr>
+    </w:lvl>
+    <w:lvl w:ilvl="2" w:tplc="04100005" w:tentative="1">
+      <w:start w:val="1"/>
+      <w:numFmt w:val="bullet"/>
+      <w:lvlText w:val=""/>
+      <w:lvlJc w:val="left"/>
+      <w:pPr>
+        <w:ind w:left="2160" w:hanging="360"/>
+      </w:pPr>
+      <w:rPr>
+        <w:rFonts w:ascii="Wingdings" w:hAnsi="Wingdings" w:hint="default"/>
+      </w:rPr>
+    </w:lvl>
+    <w:lvl w:ilvl="3" w:tplc="04100001" w:tentative="1">
+      <w:start w:val="1"/>
+      <w:numFmt w:val="bullet"/>
+      <w:lvlText w:val=""/>
+      <w:lvlJc w:val="left"/>
+      <w:pPr>
+        <w:ind w:left="2880" w:hanging="360"/>
+      </w:pPr>
+      <w:rPr>
+        <w:rFonts w:ascii="Symbol" w:hAnsi="Symbol" w:hint="default"/>
+      </w:rPr>
+    </w:lvl>
+    <w:lvl w:ilvl="4" w:tplc="04100003" w:tentative="1">
+      <w:start w:val="1"/>
+      <w:numFmt w:val="bullet"/>
+      <w:lvlText w:val="o"/>
+      <w:lvlJc w:val="left"/>
+      <w:pPr>
+        <w:ind w:left="3600" w:hanging="360"/>
+      </w:pPr>
+      <w:rPr>
+        <w:rFonts w:ascii="Courier New" w:hAnsi="Courier New" w:cs="Courier New" w:hint="default"/>
+      </w:rPr>
+    </w:lvl>
+    <w:lvl w:ilvl="5" w:tplc="04100005" w:tentative="1">
+      <w:start w:val="1"/>
+      <w:numFmt w:val="bullet"/>
+      <w:lvlText w:val=""/>
+      <w:lvlJc w:val="left"/>
+      <w:pPr>
+        <w:ind w:left="4320" w:hanging="360"/>
+      </w:pPr>
+      <w:rPr>
+        <w:rFonts w:ascii="Wingdings" w:hAnsi="Wingdings" w:hint="default"/>
+      </w:rPr>
+    </w:lvl>
+    <w:lvl w:ilvl="6" w:tplc="04100001" w:tentative="1">
+      <w:start w:val="1"/>
+      <w:numFmt w:val="bullet"/>
+      <w:lvlText w:val=""/>
+      <w:lvlJc w:val="left"/>
+      <w:pPr>
+        <w:ind w:left="5040" w:hanging="360"/>
+      </w:pPr>
+      <w:rPr>
+        <w:rFonts w:ascii="Symbol" w:hAnsi="Symbol" w:hint="default"/>
+      </w:rPr>
+    </w:lvl>
+    <w:lvl w:ilvl="7" w:tplc="04100003" w:tentative="1">
+      <w:start w:val="1"/>
+      <w:numFmt w:val="bullet"/>
+      <w:lvlText w:val="o"/>
+      <w:lvlJc w:val="left"/>
+      <w:pPr>
+        <w:ind w:left="5760" w:hanging="360"/>
+      </w:pPr>
+      <w:rPr>
+        <w:rFonts w:ascii="Courier New" w:hAnsi="Courier New" w:cs="Courier New" w:hint="default"/>
+      </w:rPr>
+    </w:lvl>
+    <w:lvl w:ilvl="8" w:tplc="04100005" w:tentative="1">
+      <w:start w:val="1"/>
+      <w:numFmt w:val="bullet"/>
+      <w:lvlText w:val=""/>
+      <w:lvlJc w:val="left"/>
+      <w:pPr>
+        <w:ind w:left="6480" w:hanging="360"/>
+      </w:pPr>
+      <w:rPr>
+        <w:rFonts w:ascii="Wingdings" w:hAnsi="Wingdings" w:hint="default"/>
+      </w:rPr>
+    </w:lvl>
+  </w:abstractNum>
   <w:num w:numId="1" w16cid:durableId="739601253">
+    <w:abstractNumId w:val="3"/>
+  </w:num>
+  <w:num w:numId="2" w16cid:durableId="1987783871">
+    <w:abstractNumId w:val="4"/>
+  </w:num>
+  <w:num w:numId="3" w16cid:durableId="1453666155">
     <w:abstractNumId w:val="2"/>
   </w:num>
-  <w:num w:numId="2" w16cid:durableId="1987783871">
-    <w:abstractNumId w:val="3"/>
-  </w:num>
-  <w:num w:numId="3" w16cid:durableId="1453666155">
+  <w:num w:numId="4" w16cid:durableId="271785175">
     <w:abstractNumId w:val="1"/>
   </w:num>
-  <w:num w:numId="4" w16cid:durableId="271785175">
+  <w:num w:numId="5" w16cid:durableId="2082091837">
+    <w:abstractNumId w:val="5"/>
+  </w:num>
+  <w:num w:numId="6" w16cid:durableId="1207448092">
     <w:abstractNumId w:val="0"/>
-  </w:num>
-  <w:num w:numId="5" w16cid:durableId="2082091837">
-    <w:abstractNumId w:val="4"/>
   </w:num>
 </w:numbering>
 </file>
@@ -5565,6 +5894,7 @@
   <w:style w:type="character" w:default="1" w:styleId="DefaultParagraphFont">
     <w:name w:val="Default Paragraph Font"/>
     <w:uiPriority w:val="1"/>
+    <w:semiHidden/>
     <w:unhideWhenUsed/>
   </w:style>
   <w:style w:type="table" w:default="1" w:styleId="TableNormal">
@@ -6079,9 +6409,12 @@
   </w:compat>
   <w:rsids>
     <w:rsidRoot w:val="0094198F"/>
+    <w:rsid w:val="002A6ABE"/>
     <w:rsid w:val="005805A2"/>
     <w:rsid w:val="0094198F"/>
+    <w:rsid w:val="00B20447"/>
     <w:rsid w:val="00C04935"/>
+    <w:rsid w:val="00F32A97"/>
   </w:rsids>
   <m:mathPr>
     <m:mathFont m:val="Cambria Math"/>
@@ -6532,38 +6865,6 @@
     <w:semiHidden/>
     <w:unhideWhenUsed/>
   </w:style>
-  <w:style w:type="paragraph" w:customStyle="1" w:styleId="4592630C918A46AC8174AE69379546ED">
-    <w:name w:val="4592630C918A46AC8174AE69379546ED"/>
-    <w:rsid w:val="0094198F"/>
-  </w:style>
-  <w:style w:type="paragraph" w:customStyle="1" w:styleId="6F6DFB191F3D402B867446942379C922">
-    <w:name w:val="6F6DFB191F3D402B867446942379C922"/>
-    <w:rsid w:val="0094198F"/>
-  </w:style>
-  <w:style w:type="paragraph" w:customStyle="1" w:styleId="DD68A79091C14CF6912E03DD5BC6E8D7">
-    <w:name w:val="DD68A79091C14CF6912E03DD5BC6E8D7"/>
-    <w:rsid w:val="0094198F"/>
-  </w:style>
-  <w:style w:type="paragraph" w:customStyle="1" w:styleId="2A71927149574F0B9A7B3B7292A9051F">
-    <w:name w:val="2A71927149574F0B9A7B3B7292A9051F"/>
-    <w:rsid w:val="0094198F"/>
-  </w:style>
-  <w:style w:type="paragraph" w:customStyle="1" w:styleId="87962502F36141B3B82585E349FD49CC">
-    <w:name w:val="87962502F36141B3B82585E349FD49CC"/>
-    <w:rsid w:val="0094198F"/>
-  </w:style>
-  <w:style w:type="paragraph" w:customStyle="1" w:styleId="0C12535FEF2646E581747D65A719EC17">
-    <w:name w:val="0C12535FEF2646E581747D65A719EC17"/>
-    <w:rsid w:val="0094198F"/>
-  </w:style>
-  <w:style w:type="paragraph" w:customStyle="1" w:styleId="00E2E17F3CFD4D859B3706F39619A202">
-    <w:name w:val="00E2E17F3CFD4D859B3706F39619A202"/>
-    <w:rsid w:val="0094198F"/>
-  </w:style>
-  <w:style w:type="paragraph" w:customStyle="1" w:styleId="504293A1739D4DC89DFE0CA222B4DEBA">
-    <w:name w:val="504293A1739D4DC89DFE0CA222B4DEBA"/>
-    <w:rsid w:val="0094198F"/>
-  </w:style>
   <w:style w:type="character" w:styleId="PlaceholderText">
     <w:name w:val="Placeholder Text"/>
     <w:basedOn w:val="DefaultParagraphFont"/>

</xml_diff>

<commit_message>
end of startup optimization. speed up music brainz
</commit_message>
<xml_diff>
--- a/docs/Euterpe guida utente.docx
+++ b/docs/Euterpe guida utente.docx
@@ -181,7 +181,23 @@
           <w:sz w:val="24"/>
           <w:szCs w:val="24"/>
         </w:rPr>
-        <w:t>1.5</w:t>
+        <w:t>5</w:t>
+      </w:r>
+      <w:r>
+        <w:rPr>
+          <w:rFonts w:ascii="Baguet Script" w:hAnsi="Baguet Script"/>
+          <w:sz w:val="24"/>
+          <w:szCs w:val="24"/>
+        </w:rPr>
+        <w:t>.</w:t>
+      </w:r>
+      <w:r>
+        <w:rPr>
+          <w:rFonts w:ascii="Baguet Script" w:hAnsi="Baguet Script"/>
+          <w:sz w:val="24"/>
+          <w:szCs w:val="24"/>
+        </w:rPr>
+        <w:t>0</w:t>
       </w:r>
     </w:p>
     <w:p>
@@ -1731,8 +1747,8 @@
         <w:lastRenderedPageBreak/>
         <w:t>Introduzione</w:t>
       </w:r>
+      <w:bookmarkEnd w:id="1"/>
       <w:bookmarkEnd w:id="0"/>
-      <w:bookmarkEnd w:id="1"/>
     </w:p>
     <w:p>
       <w:pPr>
@@ -2254,14 +2270,7 @@
           <w:rFonts w:ascii="Times New Roman" w:hAnsi="Times New Roman" w:cs="Times New Roman"/>
           <w:kern w:val="0"/>
         </w:rPr>
-        <w:t xml:space="preserve">Riconoscere il brano in riproduzione </w:t>
-      </w:r>
-      <w:r>
-        <w:rPr>
-          <w:rFonts w:ascii="Times New Roman" w:hAnsi="Times New Roman" w:cs="Times New Roman"/>
-          <w:kern w:val="0"/>
-        </w:rPr>
-        <w:t xml:space="preserve">(viene utilizzato Shazam </w:t>
+        <w:t xml:space="preserve">Riconoscere il brano in riproduzione (viene utilizzato Shazam </w:t>
       </w:r>
       <w:r>
         <w:rPr>
@@ -5367,21 +5376,7 @@
           <w:rFonts w:ascii="Times New Roman" w:hAnsi="Times New Roman" w:cs="Times New Roman"/>
           <w:kern w:val="0"/>
         </w:rPr>
-        <w:t xml:space="preserve">Quando si </w:t>
-      </w:r>
-      <w:r>
-        <w:rPr>
-          <w:rFonts w:ascii="Times New Roman" w:hAnsi="Times New Roman" w:cs="Times New Roman"/>
-          <w:kern w:val="0"/>
-        </w:rPr>
-        <w:t>attiva la riproduzione Euterpe passa</w:t>
-      </w:r>
-      <w:r>
-        <w:rPr>
-          <w:rFonts w:ascii="Times New Roman" w:hAnsi="Times New Roman" w:cs="Times New Roman"/>
-          <w:kern w:val="0"/>
-        </w:rPr>
-        <w:t xml:space="preserve"> automaticamente alla schermata riproduzione.</w:t>
+        <w:t>Quando si attiva la riproduzione Euterpe passa automaticamente alla schermata riproduzione.</w:t>
       </w:r>
     </w:p>
     <w:p>
@@ -5800,28 +5795,7 @@
           <w:rFonts w:ascii="Times New Roman" w:hAnsi="Times New Roman" w:cs="Times New Roman"/>
           <w:kern w:val="0"/>
         </w:rPr>
-        <w:t xml:space="preserve">Nell’ultima colonna </w:t>
-      </w:r>
-      <w:r>
-        <w:rPr>
-          <w:rFonts w:ascii="Times New Roman" w:hAnsi="Times New Roman" w:cs="Times New Roman"/>
-          <w:kern w:val="0"/>
-        </w:rPr>
-        <w:t xml:space="preserve">della tabella prodotta a seguito di una ricerca </w:t>
-      </w:r>
-      <w:r>
-        <w:rPr>
-          <w:rFonts w:ascii="Times New Roman" w:hAnsi="Times New Roman" w:cs="Times New Roman"/>
-          <w:kern w:val="0"/>
-        </w:rPr>
-        <w:t xml:space="preserve">troviamo l’icona play </w:t>
-      </w:r>
-      <w:r>
-        <w:rPr>
-          <w:rFonts w:ascii="Times New Roman" w:hAnsi="Times New Roman" w:cs="Times New Roman"/>
-          <w:kern w:val="0"/>
-        </w:rPr>
-        <w:t>premendola questa viene attivata</w:t>
+        <w:t>Nell’ultima colonna della tabella prodotta a seguito di una ricerca troviamo l’icona play premendola questa viene attivata</w:t>
       </w:r>
     </w:p>
     <w:p>
@@ -7370,13 +7344,7 @@
         <w:t xml:space="preserve"> - </w:t>
       </w:r>
       <w:r>
-        <w:t xml:space="preserve"> aiff'</w:t>
-      </w:r>
-      <w:r>
-        <w:t xml:space="preserve"> </w:t>
-      </w:r>
-      <w:r>
-        <w:t>Audio Interchange File Format</w:t>
+        <w:t xml:space="preserve"> aiff' Audio Interchange File Format</w:t>
       </w:r>
       <w:r>
         <w:t xml:space="preserve"> </w:t>
@@ -7397,13 +7365,7 @@
         </w:numPr>
       </w:pPr>
       <w:r>
-        <w:t xml:space="preserve"> flac</w:t>
-      </w:r>
-      <w:r>
-        <w:t xml:space="preserve">, </w:t>
-      </w:r>
-      <w:r>
-        <w:t>Free Lossless Audio Codec</w:t>
+        <w:t xml:space="preserve"> flac, Free Lossless Audio Codec</w:t>
       </w:r>
       <w:r>
         <w:t xml:space="preserve"> </w:t>
@@ -7442,10 +7404,7 @@
         <w:t>av</w:t>
       </w:r>
       <w:r>
-        <w:t xml:space="preserve">, </w:t>
-      </w:r>
-      <w:r>
-        <w:t>Waveform Audio File Format)è uno</w:t>
+        <w:t>, Waveform Audio File Format)è uno</w:t>
       </w:r>
       <w:r>
         <w:t xml:space="preserve"> </w:t>
@@ -7469,13 +7428,7 @@
         </w:numPr>
       </w:pPr>
       <w:r>
-        <w:t>m4a</w:t>
-      </w:r>
-      <w:r>
-        <w:t xml:space="preserve">, </w:t>
-      </w:r>
-      <w:r>
-        <w:t>file audio compresso, basato sullo standard MPEG-4 Audio, sviluppato da Apple per archiviare musica e audiolibri</w:t>
+        <w:t>m4a, file audio compresso, basato sullo standard MPEG-4 Audio, sviluppato da Apple per archiviare musica e audiolibri</w:t>
       </w:r>
     </w:p>
     <w:p>
@@ -7486,16 +7439,16 @@
         <mc:AlternateContent>
           <mc:Choice Requires="wps">
             <w:drawing>
-              <wp:anchor distT="45720" distB="45720" distL="114300" distR="114300" simplePos="0" relativeHeight="251682816" behindDoc="0" locked="0" layoutInCell="1" allowOverlap="1" wp14:anchorId="1CE961FF" wp14:editId="31552FDC">
+              <wp:anchor distT="45720" distB="45720" distL="114300" distR="114300" simplePos="0" relativeHeight="251682816" behindDoc="0" locked="0" layoutInCell="1" allowOverlap="1" wp14:anchorId="1CE961FF" wp14:editId="7C00CC50">
                 <wp:simplePos x="0" y="0"/>
                 <wp:positionH relativeFrom="margin">
-                  <wp:align>center</wp:align>
+                  <wp:posOffset>294198</wp:posOffset>
                 </wp:positionH>
                 <wp:positionV relativeFrom="paragraph">
-                  <wp:posOffset>407753</wp:posOffset>
+                  <wp:posOffset>462694</wp:posOffset>
                 </wp:positionV>
-                <wp:extent cx="5605145" cy="3148330"/>
-                <wp:effectExtent l="0" t="0" r="14605" b="13970"/>
+                <wp:extent cx="5979160" cy="3355340"/>
+                <wp:effectExtent l="0" t="0" r="21590" b="16510"/>
                 <wp:wrapTopAndBottom/>
                 <wp:docPr id="57634593" name="Casella di testo 2"/>
                 <wp:cNvGraphicFramePr>
@@ -7510,7 +7463,7 @@
                       <wps:spPr bwMode="auto">
                         <a:xfrm>
                           <a:off x="0" y="0"/>
-                          <a:ext cx="5605145" cy="3148330"/>
+                          <a:ext cx="5979160" cy="3355340"/>
                         </a:xfrm>
                         <a:prstGeom prst="rect">
                           <a:avLst/>
@@ -7539,9 +7492,9 @@
                                 <w:noProof/>
                               </w:rPr>
                               <w:drawing>
-                                <wp:inline distT="0" distB="0" distL="0" distR="0" wp14:anchorId="0574C859" wp14:editId="05C410DA">
-                                  <wp:extent cx="5364000" cy="2970000"/>
-                                  <wp:effectExtent l="0" t="0" r="8255" b="1905"/>
+                                <wp:inline distT="0" distB="0" distL="0" distR="0" wp14:anchorId="0574C859" wp14:editId="373DA6F8">
+                                  <wp:extent cx="5799600" cy="3211200"/>
+                                  <wp:effectExtent l="0" t="0" r="0" b="8255"/>
                                   <wp:docPr id="1150032360" name="Picture 1" descr="A screenshot of a computer&#10;&#10;AI-generated content may be incorrect."/>
                                   <wp:cNvGraphicFramePr>
                                     <a:graphicFrameLocks xmlns:a="http://schemas.openxmlformats.org/drawingml/2006/main" noChangeAspect="1"/>
@@ -7562,7 +7515,7 @@
                                         <pic:spPr>
                                           <a:xfrm>
                                             <a:off x="0" y="0"/>
-                                            <a:ext cx="5364000" cy="2970000"/>
+                                            <a:ext cx="5799600" cy="3211200"/>
                                           </a:xfrm>
                                           <a:prstGeom prst="rect">
                                             <a:avLst/>
@@ -7594,7 +7547,7 @@
           </mc:Choice>
           <mc:Fallback>
             <w:pict>
-              <v:shape w14:anchorId="1CE961FF" id="_x0000_s1037" type="#_x0000_t202" style="position:absolute;margin-left:0;margin-top:32.1pt;width:441.35pt;height:247.9pt;z-index:251682816;visibility:visible;mso-wrap-style:square;mso-width-percent:0;mso-height-percent:0;mso-wrap-distance-left:9pt;mso-wrap-distance-top:3.6pt;mso-wrap-distance-right:9pt;mso-wrap-distance-bottom:3.6pt;mso-position-horizontal:center;mso-position-horizontal-relative:margin;mso-position-vertical:absolute;mso-position-vertical-relative:text;mso-width-percent:0;mso-height-percent:0;mso-width-relative:margin;mso-height-relative:margin;v-text-anchor:top" o:gfxdata="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">
+              <v:shape w14:anchorId="1CE961FF" id="_x0000_s1037" type="#_x0000_t202" style="position:absolute;margin-left:23.15pt;margin-top:36.45pt;width:470.8pt;height:264.2pt;z-index:251682816;visibility:visible;mso-wrap-style:square;mso-width-percent:0;mso-height-percent:0;mso-wrap-distance-left:9pt;mso-wrap-distance-top:3.6pt;mso-wrap-distance-right:9pt;mso-wrap-distance-bottom:3.6pt;mso-position-horizontal:absolute;mso-position-horizontal-relative:margin;mso-position-vertical:absolute;mso-position-vertical-relative:text;mso-width-percent:0;mso-height-percent:0;mso-width-relative:margin;mso-height-relative:margin;v-text-anchor:top" o:gfxdata="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">
                 <v:textbox>
                   <w:txbxContent>
                     <w:p>
@@ -7607,9 +7560,9 @@
                           <w:noProof/>
                         </w:rPr>
                         <w:drawing>
-                          <wp:inline distT="0" distB="0" distL="0" distR="0" wp14:anchorId="0574C859" wp14:editId="05C410DA">
-                            <wp:extent cx="5364000" cy="2970000"/>
-                            <wp:effectExtent l="0" t="0" r="8255" b="1905"/>
+                          <wp:inline distT="0" distB="0" distL="0" distR="0" wp14:anchorId="0574C859" wp14:editId="373DA6F8">
+                            <wp:extent cx="5799600" cy="3211200"/>
+                            <wp:effectExtent l="0" t="0" r="0" b="8255"/>
                             <wp:docPr id="1150032360" name="Picture 1" descr="A screenshot of a computer&#10;&#10;AI-generated content may be incorrect."/>
                             <wp:cNvGraphicFramePr>
                               <a:graphicFrameLocks xmlns:a="http://schemas.openxmlformats.org/drawingml/2006/main" noChangeAspect="1"/>
@@ -7630,7 +7583,7 @@
                                   <pic:spPr>
                                     <a:xfrm>
                                       <a:off x="0" y="0"/>
-                                      <a:ext cx="5364000" cy="2970000"/>
+                                      <a:ext cx="5799600" cy="3211200"/>
                                     </a:xfrm>
                                     <a:prstGeom prst="rect">
                                       <a:avLst/>
@@ -7654,7 +7607,7 @@
     </w:p>
     <w:p>
       <w:r>
-        <w:t>Nella barra superiore troviamo la cartella selezionata per l’importazione che possiamo cambiare impostandola dalla box che si attiva facendo clic sul bottone “Scegli cartella”.</w:t>
+        <w:t>Nella barra superiore troviamo la cartella selezionata per l’importazione che possiamo cambiare impostandola facendo clic sul bottone “Scegli cartella”.</w:t>
       </w:r>
     </w:p>
     <w:p>
@@ -7710,23 +7663,130 @@
         <w:t>Genere</w:t>
       </w:r>
     </w:p>
+    <w:p>
+      <w:r>
+        <w:lastRenderedPageBreak/>
+        <w:t>Il bottone “</w:t>
+      </w:r>
+      <w:r>
+        <w:rPr>
+          <w:i/>
+          <w:iCs/>
+        </w:rPr>
+        <w:t>Applica info globali</w:t>
+      </w:r>
+      <w:r>
+        <w:t>” permette di assegnare a tutte le tracce i valori impostati nelle caselle globali. Saranno impostati solo quei campi in cui il valore è stato digitato, quindi se un campo rimane vuoto la corrispondente colonna della tabella non verrà alterata. Le colonne</w:t>
+      </w:r>
+    </w:p>
+    <w:p>
+      <w:pPr>
+        <w:pStyle w:val="ListParagraph"/>
+        <w:numPr>
+          <w:ilvl w:val="0"/>
+          <w:numId w:val="11"/>
+        </w:numPr>
+      </w:pPr>
+      <w:r>
+        <w:t>Titolo</w:t>
+      </w:r>
+    </w:p>
+    <w:p>
+      <w:pPr>
+        <w:pStyle w:val="ListParagraph"/>
+        <w:numPr>
+          <w:ilvl w:val="0"/>
+          <w:numId w:val="11"/>
+        </w:numPr>
+      </w:pPr>
+      <w:r>
+        <w:t>Artista</w:t>
+      </w:r>
+    </w:p>
+    <w:p>
+      <w:pPr>
+        <w:pStyle w:val="ListParagraph"/>
+        <w:numPr>
+          <w:ilvl w:val="0"/>
+          <w:numId w:val="11"/>
+        </w:numPr>
+      </w:pPr>
+      <w:r>
+        <w:t>Album</w:t>
+      </w:r>
+    </w:p>
+    <w:p>
+      <w:pPr>
+        <w:pStyle w:val="ListParagraph"/>
+        <w:numPr>
+          <w:ilvl w:val="0"/>
+          <w:numId w:val="11"/>
+        </w:numPr>
+      </w:pPr>
+      <w:r>
+        <w:t>Anno</w:t>
+      </w:r>
+    </w:p>
+    <w:p>
+      <w:pPr>
+        <w:pStyle w:val="ListParagraph"/>
+        <w:numPr>
+          <w:ilvl w:val="0"/>
+          <w:numId w:val="11"/>
+        </w:numPr>
+      </w:pPr>
+      <w:r>
+        <w:t>Genere</w:t>
+      </w:r>
+    </w:p>
+    <w:p>
+      <w:pPr>
+        <w:pStyle w:val="ListParagraph"/>
+        <w:numPr>
+          <w:ilvl w:val="0"/>
+          <w:numId w:val="11"/>
+        </w:numPr>
+      </w:pPr>
+      <w:r>
+        <w:t>Traccia</w:t>
+      </w:r>
+    </w:p>
+    <w:p>
+      <w:r>
+        <w:t>Possono essere modificato puntualmente facendo doppio clic sulla casella di cui si desidera cambiare il valore.</w:t>
+      </w:r>
+    </w:p>
+    <w:p>
+      <w:r>
+        <w:t>Se è presente una copertina questa viene visualizzata nell’apposito riquadro.</w:t>
+      </w:r>
+    </w:p>
+    <w:p>
+      <w:r>
+        <w:t>È possibile assegnare una copertina selezionandola da file (si preme il bottone da file e si sceglie il file desiderato), o prelevandola dalla clipboard (si preme il bottone da clipboard). In entrambi i casi la dimensione dell’immagine verrà ottimizzata. Il bottone elimina copertina permette di eliminarla.</w:t>
+      </w:r>
+    </w:p>
+    <w:p>
+      <w:r>
+        <w:t>Nell’ultima riga della finestra sono presenti i comandi per la conversione che permettono di scegliere il bitrate secondo valori prestabiliti che vanno da 128 a 320 Kbit/sec. La cartella in cui scaricare i file convertiti ed infine il bottone per avviare la conversione.</w:t>
+      </w:r>
+    </w:p>
+    <w:p>
+      <w:pPr>
+        <w:pStyle w:val="Heading2"/>
+      </w:pPr>
+      <w:bookmarkStart w:id="17" w:name="_Toc214356865"/>
+      <w:r>
+        <w:t>CD ripper</w:t>
+      </w:r>
+      <w:bookmarkEnd w:id="17"/>
+    </w:p>
+    <w:p>
+      <w:r>
+        <w:t>Permette di trasformare in file MP3 il contenuto di un CD musicale</w:t>
+      </w:r>
+    </w:p>
     <w:p/>
-    <w:p/>
-    <w:p>
-      <w:pPr>
-        <w:pStyle w:val="Heading2"/>
-      </w:pPr>
-      <w:bookmarkStart w:id="17" w:name="_Toc214356865"/>
-      <w:r>
-        <w:t>CD ripper</w:t>
-      </w:r>
-      <w:bookmarkEnd w:id="17"/>
-    </w:p>
-    <w:p>
-      <w:r>
-        <w:t>Permette di trasformare in file MP3 il contenuto di un CD musicale</w:t>
-      </w:r>
-    </w:p>
     <w:p>
       <w:pPr>
         <w:pStyle w:val="Heading2"/>
@@ -7941,6 +8001,7 @@
       </w:pPr>
       <w:bookmarkStart w:id="19" w:name="_Toc214356867"/>
       <w:r>
+        <w:lastRenderedPageBreak/>
         <w:t>Sincronizza</w:t>
       </w:r>
       <w:bookmarkEnd w:id="19"/>
@@ -7956,7 +8017,6 @@
       </w:pPr>
       <w:bookmarkStart w:id="20" w:name="_Toc214356868"/>
       <w:r>
-        <w:lastRenderedPageBreak/>
         <w:t>Informazioni</w:t>
       </w:r>
       <w:bookmarkEnd w:id="20"/>
@@ -8342,6 +8402,7 @@
           <w:dataBinding w:prefixMappings="xmlns:ns0='http://purl.org/dc/elements/1.1/' xmlns:ns1='http://schemas.openxmlformats.org/package/2006/metadata/core-properties' " w:xpath="/ns1:coreProperties[1]/ns0:creator[1]" w:storeItemID="{6C3C8BC8-F283-45AE-878A-BAB7291924A1}"/>
           <w:text/>
         </w:sdtPr>
+        <w:sdtEndPr/>
         <w:sdtContent>
           <w:tc>
             <w:tcPr>
@@ -9377,95 +9438,9 @@
     </w:lvl>
   </w:abstractNum>
   <w:abstractNum w:abstractNumId="8" w15:restartNumberingAfterBreak="0">
-    <w:nsid w:val="5A1C2E28"/>
+    <w:nsid w:val="5A0959D7"/>
     <w:multiLevelType w:val="hybridMultilevel"/>
-    <w:tmpl w:val="FC226582"/>
-    <w:lvl w:ilvl="0" w:tplc="0410000F">
-      <w:start w:val="1"/>
-      <w:numFmt w:val="decimal"/>
-      <w:lvlText w:val="%1."/>
-      <w:lvlJc w:val="left"/>
-      <w:pPr>
-        <w:ind w:left="720" w:hanging="360"/>
-      </w:pPr>
-    </w:lvl>
-    <w:lvl w:ilvl="1" w:tplc="04100019" w:tentative="1">
-      <w:start w:val="1"/>
-      <w:numFmt w:val="lowerLetter"/>
-      <w:lvlText w:val="%2."/>
-      <w:lvlJc w:val="left"/>
-      <w:pPr>
-        <w:ind w:left="1440" w:hanging="360"/>
-      </w:pPr>
-    </w:lvl>
-    <w:lvl w:ilvl="2" w:tplc="0410001B" w:tentative="1">
-      <w:start w:val="1"/>
-      <w:numFmt w:val="lowerRoman"/>
-      <w:lvlText w:val="%3."/>
-      <w:lvlJc w:val="right"/>
-      <w:pPr>
-        <w:ind w:left="2160" w:hanging="180"/>
-      </w:pPr>
-    </w:lvl>
-    <w:lvl w:ilvl="3" w:tplc="0410000F" w:tentative="1">
-      <w:start w:val="1"/>
-      <w:numFmt w:val="decimal"/>
-      <w:lvlText w:val="%4."/>
-      <w:lvlJc w:val="left"/>
-      <w:pPr>
-        <w:ind w:left="2880" w:hanging="360"/>
-      </w:pPr>
-    </w:lvl>
-    <w:lvl w:ilvl="4" w:tplc="04100019" w:tentative="1">
-      <w:start w:val="1"/>
-      <w:numFmt w:val="lowerLetter"/>
-      <w:lvlText w:val="%5."/>
-      <w:lvlJc w:val="left"/>
-      <w:pPr>
-        <w:ind w:left="3600" w:hanging="360"/>
-      </w:pPr>
-    </w:lvl>
-    <w:lvl w:ilvl="5" w:tplc="0410001B" w:tentative="1">
-      <w:start w:val="1"/>
-      <w:numFmt w:val="lowerRoman"/>
-      <w:lvlText w:val="%6."/>
-      <w:lvlJc w:val="right"/>
-      <w:pPr>
-        <w:ind w:left="4320" w:hanging="180"/>
-      </w:pPr>
-    </w:lvl>
-    <w:lvl w:ilvl="6" w:tplc="0410000F" w:tentative="1">
-      <w:start w:val="1"/>
-      <w:numFmt w:val="decimal"/>
-      <w:lvlText w:val="%7."/>
-      <w:lvlJc w:val="left"/>
-      <w:pPr>
-        <w:ind w:left="5040" w:hanging="360"/>
-      </w:pPr>
-    </w:lvl>
-    <w:lvl w:ilvl="7" w:tplc="04100019" w:tentative="1">
-      <w:start w:val="1"/>
-      <w:numFmt w:val="lowerLetter"/>
-      <w:lvlText w:val="%8."/>
-      <w:lvlJc w:val="left"/>
-      <w:pPr>
-        <w:ind w:left="5760" w:hanging="360"/>
-      </w:pPr>
-    </w:lvl>
-    <w:lvl w:ilvl="8" w:tplc="0410001B" w:tentative="1">
-      <w:start w:val="1"/>
-      <w:numFmt w:val="lowerRoman"/>
-      <w:lvlText w:val="%9."/>
-      <w:lvlJc w:val="right"/>
-      <w:pPr>
-        <w:ind w:left="6480" w:hanging="180"/>
-      </w:pPr>
-    </w:lvl>
-  </w:abstractNum>
-  <w:abstractNum w:abstractNumId="9" w15:restartNumberingAfterBreak="0">
-    <w:nsid w:val="642113FA"/>
-    <w:multiLevelType w:val="hybridMultilevel"/>
-    <w:tmpl w:val="1230407A"/>
+    <w:tmpl w:val="C7BE6F08"/>
     <w:lvl w:ilvl="0" w:tplc="04100001">
       <w:start w:val="1"/>
       <w:numFmt w:val="bullet"/>
@@ -9575,11 +9550,210 @@
       </w:rPr>
     </w:lvl>
   </w:abstractNum>
+  <w:abstractNum w:abstractNumId="9" w15:restartNumberingAfterBreak="0">
+    <w:nsid w:val="5A1C2E28"/>
+    <w:multiLevelType w:val="hybridMultilevel"/>
+    <w:tmpl w:val="FC226582"/>
+    <w:lvl w:ilvl="0" w:tplc="0410000F">
+      <w:start w:val="1"/>
+      <w:numFmt w:val="decimal"/>
+      <w:lvlText w:val="%1."/>
+      <w:lvlJc w:val="left"/>
+      <w:pPr>
+        <w:ind w:left="720" w:hanging="360"/>
+      </w:pPr>
+    </w:lvl>
+    <w:lvl w:ilvl="1" w:tplc="04100019" w:tentative="1">
+      <w:start w:val="1"/>
+      <w:numFmt w:val="lowerLetter"/>
+      <w:lvlText w:val="%2."/>
+      <w:lvlJc w:val="left"/>
+      <w:pPr>
+        <w:ind w:left="1440" w:hanging="360"/>
+      </w:pPr>
+    </w:lvl>
+    <w:lvl w:ilvl="2" w:tplc="0410001B" w:tentative="1">
+      <w:start w:val="1"/>
+      <w:numFmt w:val="lowerRoman"/>
+      <w:lvlText w:val="%3."/>
+      <w:lvlJc w:val="right"/>
+      <w:pPr>
+        <w:ind w:left="2160" w:hanging="180"/>
+      </w:pPr>
+    </w:lvl>
+    <w:lvl w:ilvl="3" w:tplc="0410000F" w:tentative="1">
+      <w:start w:val="1"/>
+      <w:numFmt w:val="decimal"/>
+      <w:lvlText w:val="%4."/>
+      <w:lvlJc w:val="left"/>
+      <w:pPr>
+        <w:ind w:left="2880" w:hanging="360"/>
+      </w:pPr>
+    </w:lvl>
+    <w:lvl w:ilvl="4" w:tplc="04100019" w:tentative="1">
+      <w:start w:val="1"/>
+      <w:numFmt w:val="lowerLetter"/>
+      <w:lvlText w:val="%5."/>
+      <w:lvlJc w:val="left"/>
+      <w:pPr>
+        <w:ind w:left="3600" w:hanging="360"/>
+      </w:pPr>
+    </w:lvl>
+    <w:lvl w:ilvl="5" w:tplc="0410001B" w:tentative="1">
+      <w:start w:val="1"/>
+      <w:numFmt w:val="lowerRoman"/>
+      <w:lvlText w:val="%6."/>
+      <w:lvlJc w:val="right"/>
+      <w:pPr>
+        <w:ind w:left="4320" w:hanging="180"/>
+      </w:pPr>
+    </w:lvl>
+    <w:lvl w:ilvl="6" w:tplc="0410000F" w:tentative="1">
+      <w:start w:val="1"/>
+      <w:numFmt w:val="decimal"/>
+      <w:lvlText w:val="%7."/>
+      <w:lvlJc w:val="left"/>
+      <w:pPr>
+        <w:ind w:left="5040" w:hanging="360"/>
+      </w:pPr>
+    </w:lvl>
+    <w:lvl w:ilvl="7" w:tplc="04100019" w:tentative="1">
+      <w:start w:val="1"/>
+      <w:numFmt w:val="lowerLetter"/>
+      <w:lvlText w:val="%8."/>
+      <w:lvlJc w:val="left"/>
+      <w:pPr>
+        <w:ind w:left="5760" w:hanging="360"/>
+      </w:pPr>
+    </w:lvl>
+    <w:lvl w:ilvl="8" w:tplc="0410001B" w:tentative="1">
+      <w:start w:val="1"/>
+      <w:numFmt w:val="lowerRoman"/>
+      <w:lvlText w:val="%9."/>
+      <w:lvlJc w:val="right"/>
+      <w:pPr>
+        <w:ind w:left="6480" w:hanging="180"/>
+      </w:pPr>
+    </w:lvl>
+  </w:abstractNum>
+  <w:abstractNum w:abstractNumId="10" w15:restartNumberingAfterBreak="0">
+    <w:nsid w:val="642113FA"/>
+    <w:multiLevelType w:val="hybridMultilevel"/>
+    <w:tmpl w:val="1230407A"/>
+    <w:lvl w:ilvl="0" w:tplc="04100001">
+      <w:start w:val="1"/>
+      <w:numFmt w:val="bullet"/>
+      <w:lvlText w:val=""/>
+      <w:lvlJc w:val="left"/>
+      <w:pPr>
+        <w:ind w:left="720" w:hanging="360"/>
+      </w:pPr>
+      <w:rPr>
+        <w:rFonts w:ascii="Symbol" w:hAnsi="Symbol" w:hint="default"/>
+      </w:rPr>
+    </w:lvl>
+    <w:lvl w:ilvl="1" w:tplc="04100003" w:tentative="1">
+      <w:start w:val="1"/>
+      <w:numFmt w:val="bullet"/>
+      <w:lvlText w:val="o"/>
+      <w:lvlJc w:val="left"/>
+      <w:pPr>
+        <w:ind w:left="1440" w:hanging="360"/>
+      </w:pPr>
+      <w:rPr>
+        <w:rFonts w:ascii="Courier New" w:hAnsi="Courier New" w:cs="Courier New" w:hint="default"/>
+      </w:rPr>
+    </w:lvl>
+    <w:lvl w:ilvl="2" w:tplc="04100005" w:tentative="1">
+      <w:start w:val="1"/>
+      <w:numFmt w:val="bullet"/>
+      <w:lvlText w:val=""/>
+      <w:lvlJc w:val="left"/>
+      <w:pPr>
+        <w:ind w:left="2160" w:hanging="360"/>
+      </w:pPr>
+      <w:rPr>
+        <w:rFonts w:ascii="Wingdings" w:hAnsi="Wingdings" w:hint="default"/>
+      </w:rPr>
+    </w:lvl>
+    <w:lvl w:ilvl="3" w:tplc="04100001" w:tentative="1">
+      <w:start w:val="1"/>
+      <w:numFmt w:val="bullet"/>
+      <w:lvlText w:val=""/>
+      <w:lvlJc w:val="left"/>
+      <w:pPr>
+        <w:ind w:left="2880" w:hanging="360"/>
+      </w:pPr>
+      <w:rPr>
+        <w:rFonts w:ascii="Symbol" w:hAnsi="Symbol" w:hint="default"/>
+      </w:rPr>
+    </w:lvl>
+    <w:lvl w:ilvl="4" w:tplc="04100003" w:tentative="1">
+      <w:start w:val="1"/>
+      <w:numFmt w:val="bullet"/>
+      <w:lvlText w:val="o"/>
+      <w:lvlJc w:val="left"/>
+      <w:pPr>
+        <w:ind w:left="3600" w:hanging="360"/>
+      </w:pPr>
+      <w:rPr>
+        <w:rFonts w:ascii="Courier New" w:hAnsi="Courier New" w:cs="Courier New" w:hint="default"/>
+      </w:rPr>
+    </w:lvl>
+    <w:lvl w:ilvl="5" w:tplc="04100005" w:tentative="1">
+      <w:start w:val="1"/>
+      <w:numFmt w:val="bullet"/>
+      <w:lvlText w:val=""/>
+      <w:lvlJc w:val="left"/>
+      <w:pPr>
+        <w:ind w:left="4320" w:hanging="360"/>
+      </w:pPr>
+      <w:rPr>
+        <w:rFonts w:ascii="Wingdings" w:hAnsi="Wingdings" w:hint="default"/>
+      </w:rPr>
+    </w:lvl>
+    <w:lvl w:ilvl="6" w:tplc="04100001" w:tentative="1">
+      <w:start w:val="1"/>
+      <w:numFmt w:val="bullet"/>
+      <w:lvlText w:val=""/>
+      <w:lvlJc w:val="left"/>
+      <w:pPr>
+        <w:ind w:left="5040" w:hanging="360"/>
+      </w:pPr>
+      <w:rPr>
+        <w:rFonts w:ascii="Symbol" w:hAnsi="Symbol" w:hint="default"/>
+      </w:rPr>
+    </w:lvl>
+    <w:lvl w:ilvl="7" w:tplc="04100003" w:tentative="1">
+      <w:start w:val="1"/>
+      <w:numFmt w:val="bullet"/>
+      <w:lvlText w:val="o"/>
+      <w:lvlJc w:val="left"/>
+      <w:pPr>
+        <w:ind w:left="5760" w:hanging="360"/>
+      </w:pPr>
+      <w:rPr>
+        <w:rFonts w:ascii="Courier New" w:hAnsi="Courier New" w:cs="Courier New" w:hint="default"/>
+      </w:rPr>
+    </w:lvl>
+    <w:lvl w:ilvl="8" w:tplc="04100005" w:tentative="1">
+      <w:start w:val="1"/>
+      <w:numFmt w:val="bullet"/>
+      <w:lvlText w:val=""/>
+      <w:lvlJc w:val="left"/>
+      <w:pPr>
+        <w:ind w:left="6480" w:hanging="360"/>
+      </w:pPr>
+      <w:rPr>
+        <w:rFonts w:ascii="Wingdings" w:hAnsi="Wingdings" w:hint="default"/>
+      </w:rPr>
+    </w:lvl>
+  </w:abstractNum>
   <w:num w:numId="1" w16cid:durableId="739601253">
     <w:abstractNumId w:val="7"/>
   </w:num>
   <w:num w:numId="2" w16cid:durableId="1987783871">
-    <w:abstractNumId w:val="8"/>
+    <w:abstractNumId w:val="9"/>
   </w:num>
   <w:num w:numId="3" w16cid:durableId="1453666155">
     <w:abstractNumId w:val="6"/>
@@ -9588,7 +9762,7 @@
     <w:abstractNumId w:val="3"/>
   </w:num>
   <w:num w:numId="5" w16cid:durableId="2082091837">
-    <w:abstractNumId w:val="9"/>
+    <w:abstractNumId w:val="10"/>
   </w:num>
   <w:num w:numId="6" w16cid:durableId="1207448092">
     <w:abstractNumId w:val="2"/>
@@ -9604,6 +9778,9 @@
   </w:num>
   <w:num w:numId="10" w16cid:durableId="1643076750">
     <w:abstractNumId w:val="0"/>
+  </w:num>
+  <w:num w:numId="11" w16cid:durableId="1224872118">
+    <w:abstractNumId w:val="8"/>
   </w:num>
 </w:numbering>
 </file>
@@ -10211,6 +10388,7 @@
   <w:style w:type="character" w:default="1" w:styleId="DefaultParagraphFont">
     <w:name w:val="Default Paragraph Font"/>
     <w:uiPriority w:val="1"/>
+    <w:semiHidden/>
     <w:unhideWhenUsed/>
   </w:style>
   <w:style w:type="table" w:default="1" w:styleId="TableNormal">
@@ -10794,6 +10972,7 @@
     <w:rsid w:val="0094198F"/>
     <w:rsid w:val="00B20447"/>
     <w:rsid w:val="00C04935"/>
+    <w:rsid w:val="00DF417D"/>
     <w:rsid w:val="00F32A97"/>
   </w:rsids>
   <m:mathPr>

</xml_diff>